<commit_message>
feat: advanced analysis tools (decoding/connectivity/source) + [full] extra; rewrite mne-analyst skill
- Add 6 tools: mne_decode (MVPA), mne_connectivity, mne_compute_noise_cov, mne_make_forward (fsaverage), mne_apply_inverse (dSPM/MNE/sLORETA/eLORETA), mne_plot_source_estimate (PyVista off-screen, best-effort). 32 -> 38 tools, dependency-gated via _require_module.
- Add [full] optional extra (mne-connectivity, mne-bids, autoreject, nibabel, pymatreader, edfio, h5io, pyvista, python-picard).
- Rewrite mne-analyst SKILL.md to best-practice form (tight trigger description, request->tool routing table, golden DO/DON'T rules, worked example, shorter body) per the write-a-skill framework + spss-analyst exemplar.
- decode/connectivity/noise-cov verified on synthetic EEG; 39 unit tests pass. Docs (README en/zh, TOOLS_REFERENCE en/zh, USAGE, INTRODUCTION, skill refs) updated to 38 tools + advanced group; docx regenerated.

Co-Authored-By: Claude Opus 4.8 (1M context) <noreply@anthropic.com>
</commit_message>
<xml_diff>
--- a/docs/INTRODUCTION.docx
+++ b/docs/INTRODUCTION.docx
@@ -419,7 +419,17 @@
         <w:t xml:space="preserve"> </w:t>
       </w:r>
       <w:r>
-        <w:t xml:space="preserve">— 常见流程有 32 个专用工具；它们覆盖不到的（源定位、连接性、解码、统计、BIDS……）可用</w:t>
+        <w:t xml:space="preserve">— 38 个专用工具覆盖常见流程</w:t>
+      </w:r>
+      <w:r>
+        <w:rPr>
+          <w:b/>
+          <w:bCs/>
+        </w:rPr>
+        <w:t xml:space="preserve">与高级分析</w:t>
+      </w:r>
+      <w:r>
+        <w:t xml:space="preserve">（源定位、连接性、解码）；其余（BIDS、统计、beamformer……）可用</w:t>
       </w:r>
       <w:r>
         <w:t xml:space="preserve"> </w:t>
@@ -526,7 +536,7 @@
         <w:rPr>
           <w:rStyle w:val="VerbatimChar"/>
         </w:rPr>
-        <w:t xml:space="preserve">  ┌─────────────┐   调用 32 个工具 / run_code   ┌──────────────────────────┐</w:t>
+        <w:t xml:space="preserve">  ┌─────────────┐   调用 38 个工具 / run_code   ┌──────────────────────────┐</w:t>
       </w:r>
       <w:r>
         <w:br/>
@@ -682,13 +692,13 @@
       </w:r>
     </w:p>
     <w:bookmarkEnd w:id="24"/>
-    <w:bookmarkStart w:id="25" w:name="能力总览32-个工具8-类"/>
+    <w:bookmarkStart w:id="25" w:name="能力总览38-个工具9-类"/>
     <w:p>
       <w:pPr>
         <w:pStyle w:val="Heading2"/>
       </w:pPr>
       <w:r>
-        <w:t xml:space="preserve">5. 能力总览（32 个工具，8 类）</w:t>
+        <w:t xml:space="preserve">5. 能力总览（38 个工具，9 类）</w:t>
       </w:r>
     </w:p>
     <w:tbl>
@@ -1159,7 +1169,7 @@
               <w:jc w:val="left"/>
             </w:pPr>
             <w:r>
-              <w:t xml:space="preserve">导出 (1)</w:t>
+              <w:t xml:space="preserve">高级分析 (6)</w:t>
             </w:r>
           </w:p>
         </w:tc>
@@ -1174,6 +1184,80 @@
               <w:rPr>
                 <w:rStyle w:val="VerbatimChar"/>
               </w:rPr>
+              <w:t xml:space="preserve">mne_decode</w:t>
+            </w:r>
+            <w:r>
+              <w:t xml:space="preserve"> </w:t>
+            </w:r>
+            <w:r>
+              <w:rPr>
+                <w:rStyle w:val="VerbatimChar"/>
+              </w:rPr>
+              <w:t xml:space="preserve">mne_connectivity</w:t>
+            </w:r>
+            <w:r>
+              <w:t xml:space="preserve"> </w:t>
+            </w:r>
+            <w:r>
+              <w:rPr>
+                <w:rStyle w:val="VerbatimChar"/>
+              </w:rPr>
+              <w:t xml:space="preserve">mne_compute_noise_cov</w:t>
+            </w:r>
+            <w:r>
+              <w:t xml:space="preserve"> </w:t>
+            </w:r>
+            <w:r>
+              <w:rPr>
+                <w:rStyle w:val="VerbatimChar"/>
+              </w:rPr>
+              <w:t xml:space="preserve">mne_make_forward</w:t>
+            </w:r>
+            <w:r>
+              <w:t xml:space="preserve"> </w:t>
+            </w:r>
+            <w:r>
+              <w:rPr>
+                <w:rStyle w:val="VerbatimChar"/>
+              </w:rPr>
+              <w:t xml:space="preserve">mne_apply_inverse</w:t>
+            </w:r>
+            <w:r>
+              <w:t xml:space="preserve"> </w:t>
+            </w:r>
+            <w:r>
+              <w:rPr>
+                <w:rStyle w:val="VerbatimChar"/>
+              </w:rPr>
+              <w:t xml:space="preserve">mne_plot_source_estimate</w:t>
+            </w:r>
+          </w:p>
+        </w:tc>
+      </w:tr>
+      <w:tr>
+        <w:tc>
+          <w:tcPr/>
+          <w:p>
+            <w:pPr>
+              <w:pStyle w:val="Compact"/>
+              <w:jc w:val="left"/>
+            </w:pPr>
+            <w:r>
+              <w:t xml:space="preserve">导出 (1)</w:t>
+            </w:r>
+          </w:p>
+        </w:tc>
+        <w:tc>
+          <w:tcPr/>
+          <w:p>
+            <w:pPr>
+              <w:pStyle w:val="Compact"/>
+              <w:jc w:val="left"/>
+            </w:pPr>
+            <w:r>
+              <w:rPr>
+                <w:rStyle w:val="VerbatimChar"/>
+              </w:rPr>
               <w:t xml:space="preserve">mne_save</w:t>
             </w:r>
           </w:p>
@@ -1182,7 +1266,39 @@
     </w:tbl>
     <w:p>
       <w:pPr>
-        <w:pStyle w:val="BodyText"/>
+        <w:pStyle w:val="BlockText"/>
+      </w:pPr>
+      <w:r>
+        <w:t xml:space="preserve">高级分析（解码/连接性/源定位）需安装</w:t>
+      </w:r>
+      <w:r>
+        <w:t xml:space="preserve"> </w:t>
+      </w:r>
+      <w:r>
+        <w:rPr>
+          <w:rStyle w:val="VerbatimChar"/>
+        </w:rPr>
+        <w:t xml:space="preserve">[full]</w:t>
+      </w:r>
+      <w:r>
+        <w:t xml:space="preserve"> </w:t>
+      </w:r>
+      <w:r>
+        <w:t xml:space="preserve">额外依赖：</w:t>
+      </w:r>
+      <w:r>
+        <w:rPr>
+          <w:rStyle w:val="VerbatimChar"/>
+        </w:rPr>
+        <w:t xml:space="preserve">pip install -e ".[full]"</w:t>
+      </w:r>
+      <w:r>
+        <w:t xml:space="preserve">。</w:t>
+      </w:r>
+    </w:p>
+    <w:p>
+      <w:pPr>
+        <w:pStyle w:val="FirstParagraph"/>
       </w:pPr>
       <w:r>
         <w:t xml:space="preserve">支持读取的格式：FIF、EDF、BDF、BrainVision(.vhdr)、EEGLAB(.set)、CNT、EGI/.mff、CTF(.ds)、SNIRF 等。</w:t>
@@ -1633,7 +1749,7 @@
         <w:rPr>
           <w:rStyle w:val="VerbatimChar"/>
         </w:rPr>
-        <w:t xml:space="preserve">│  ├─ server.py        # 32 个 MCP 工具定义（薄封装）</w:t>
+        <w:t xml:space="preserve">│  ├─ server.py        # 38 个 MCP 工具定义（薄封装）</w:t>
       </w:r>
       <w:r>
         <w:br/>
@@ -1785,7 +1901,7 @@
         </w:numPr>
       </w:pPr>
       <w:r>
-        <w:t xml:space="preserve">通过真实 MCP 客户端验证 32 个工具的调用与持久会话。</w:t>
+        <w:t xml:space="preserve">通过真实 MCP 客户端验证 38 个工具的调用与持久会话。</w:t>
       </w:r>
     </w:p>
     <w:p>

</xml_diff>